<commit_message>
AEP : First draft
</commit_message>
<xml_diff>
--- a/adobe/aep/assets/ProfileStrategyGuide.docx
+++ b/adobe/aep/assets/ProfileStrategyGuide.docx
@@ -1750,34 +1750,219 @@
         <w:t>How all datasets and data is linked together.</w:t>
       </w:r>
     </w:p>
-    <w:p>
-      <w:pPr>
-        <w:rPr>
-          <w:lang w:val="en-US"/>
-        </w:rPr>
-      </w:pPr>
-    </w:p>
-    <w:p>
-      <w:pPr>
-        <w:rPr>
-          <w:lang w:val="en-US"/>
-        </w:rPr>
-      </w:pPr>
-    </w:p>
-    <w:p>
-      <w:pPr>
-        <w:rPr>
-          <w:lang w:val="en-US"/>
-        </w:rPr>
-      </w:pPr>
-    </w:p>
-    <w:p>
-      <w:pPr>
-        <w:rPr>
-          <w:lang w:val="en-US"/>
-        </w:rPr>
-      </w:pPr>
-    </w:p>
+    <w:tbl>
+      <w:tblPr>
+        <w:tblStyle w:val="GridTable1Light"/>
+        <w:tblW w:w="0" w:type="auto"/>
+        <w:tblLook w:val="04A0" w:firstRow="1" w:lastRow="0" w:firstColumn="1" w:lastColumn="0" w:noHBand="0" w:noVBand="1"/>
+      </w:tblPr>
+      <w:tblGrid>
+        <w:gridCol w:w="2263"/>
+        <w:gridCol w:w="1418"/>
+        <w:gridCol w:w="1559"/>
+        <w:gridCol w:w="2268"/>
+        <w:gridCol w:w="1842"/>
+      </w:tblGrid>
+      <w:tr>
+        <w:trPr>
+          <w:cnfStyle w:val="100000000000" w:firstRow="1" w:lastRow="0" w:firstColumn="0" w:lastColumn="0" w:oddVBand="0" w:evenVBand="0" w:oddHBand="0" w:evenHBand="0" w:firstRowFirstColumn="0" w:firstRowLastColumn="0" w:lastRowFirstColumn="0" w:lastRowLastColumn="0"/>
+        </w:trPr>
+        <w:tc>
+          <w:tcPr>
+            <w:cnfStyle w:val="001000000000" w:firstRow="0" w:lastRow="0" w:firstColumn="1" w:lastColumn="0" w:oddVBand="0" w:evenVBand="0" w:oddHBand="0" w:evenHBand="0" w:firstRowFirstColumn="0" w:firstRowLastColumn="0" w:lastRowFirstColumn="0" w:lastRowLastColumn="0"/>
+            <w:tcW w:w="2263" w:type="dxa"/>
+          </w:tcPr>
+          <w:p>
+            <w:pPr>
+              <w:rPr>
+                <w:lang w:val="en-US"/>
+              </w:rPr>
+            </w:pPr>
+            <w:r>
+              <w:rPr>
+                <w:lang w:val="en-US"/>
+              </w:rPr>
+              <w:t>Merge Policy Name</w:t>
+            </w:r>
+          </w:p>
+        </w:tc>
+        <w:tc>
+          <w:tcPr>
+            <w:tcW w:w="1418" w:type="dxa"/>
+          </w:tcPr>
+          <w:p>
+            <w:pPr>
+              <w:cnfStyle w:val="100000000000" w:firstRow="1" w:lastRow="0" w:firstColumn="0" w:lastColumn="0" w:oddVBand="0" w:evenVBand="0" w:oddHBand="0" w:evenHBand="0" w:firstRowFirstColumn="0" w:firstRowLastColumn="0" w:lastRowFirstColumn="0" w:lastRowLastColumn="0"/>
+              <w:rPr>
+                <w:lang w:val="en-US"/>
+              </w:rPr>
+            </w:pPr>
+            <w:r>
+              <w:rPr>
+                <w:lang w:val="en-US"/>
+              </w:rPr>
+              <w:t>Type</w:t>
+            </w:r>
+          </w:p>
+        </w:tc>
+        <w:tc>
+          <w:tcPr>
+            <w:tcW w:w="1559" w:type="dxa"/>
+          </w:tcPr>
+          <w:p>
+            <w:pPr>
+              <w:cnfStyle w:val="100000000000" w:firstRow="1" w:lastRow="0" w:firstColumn="0" w:lastColumn="0" w:oddVBand="0" w:evenVBand="0" w:oddHBand="0" w:evenHBand="0" w:firstRowFirstColumn="0" w:firstRowLastColumn="0" w:lastRowFirstColumn="0" w:lastRowLastColumn="0"/>
+              <w:rPr>
+                <w:lang w:val="en-US"/>
+              </w:rPr>
+            </w:pPr>
+            <w:r>
+              <w:rPr>
+                <w:lang w:val="en-US"/>
+              </w:rPr>
+              <w:t>ID stitching</w:t>
+            </w:r>
+          </w:p>
+        </w:tc>
+        <w:tc>
+          <w:tcPr>
+            <w:tcW w:w="2268" w:type="dxa"/>
+          </w:tcPr>
+          <w:p>
+            <w:pPr>
+              <w:cnfStyle w:val="100000000000" w:firstRow="1" w:lastRow="0" w:firstColumn="0" w:lastColumn="0" w:oddVBand="0" w:evenVBand="0" w:oddHBand="0" w:evenHBand="0" w:firstRowFirstColumn="0" w:firstRowLastColumn="0" w:lastRowFirstColumn="0" w:lastRowLastColumn="0"/>
+              <w:rPr>
+                <w:lang w:val="en-US"/>
+              </w:rPr>
+            </w:pPr>
+            <w:r>
+              <w:rPr>
+                <w:lang w:val="en-US"/>
+              </w:rPr>
+              <w:t>Attribute merge</w:t>
+            </w:r>
+          </w:p>
+        </w:tc>
+        <w:tc>
+          <w:tcPr>
+            <w:tcW w:w="1842" w:type="dxa"/>
+          </w:tcPr>
+          <w:p>
+            <w:pPr>
+              <w:cnfStyle w:val="100000000000" w:firstRow="1" w:lastRow="0" w:firstColumn="0" w:lastColumn="0" w:oddVBand="0" w:evenVBand="0" w:oddHBand="0" w:evenHBand="0" w:firstRowFirstColumn="0" w:firstRowLastColumn="0" w:lastRowFirstColumn="0" w:lastRowLastColumn="0"/>
+              <w:rPr>
+                <w:lang w:val="en-US"/>
+              </w:rPr>
+            </w:pPr>
+            <w:r>
+              <w:rPr>
+                <w:lang w:val="en-US"/>
+              </w:rPr>
+              <w:t>Default merge policy</w:t>
+            </w:r>
+          </w:p>
+        </w:tc>
+      </w:tr>
+      <w:tr>
+        <w:tc>
+          <w:tcPr>
+            <w:cnfStyle w:val="001000000000" w:firstRow="0" w:lastRow="0" w:firstColumn="1" w:lastColumn="0" w:oddVBand="0" w:evenVBand="0" w:oddHBand="0" w:evenHBand="0" w:firstRowFirstColumn="0" w:firstRowLastColumn="0" w:lastRowFirstColumn="0" w:lastRowLastColumn="0"/>
+            <w:tcW w:w="2263" w:type="dxa"/>
+          </w:tcPr>
+          <w:p>
+            <w:pPr>
+              <w:tabs>
+                <w:tab w:val="left" w:pos="988"/>
+              </w:tabs>
+              <w:rPr>
+                <w:lang w:val="en-US"/>
+              </w:rPr>
+            </w:pPr>
+            <w:r>
+              <w:t>Default Timebased</w:t>
+            </w:r>
+          </w:p>
+        </w:tc>
+        <w:tc>
+          <w:tcPr>
+            <w:tcW w:w="1418" w:type="dxa"/>
+          </w:tcPr>
+          <w:p>
+            <w:pPr>
+              <w:cnfStyle w:val="000000000000" w:firstRow="0" w:lastRow="0" w:firstColumn="0" w:lastColumn="0" w:oddVBand="0" w:evenVBand="0" w:oddHBand="0" w:evenHBand="0" w:firstRowFirstColumn="0" w:firstRowLastColumn="0" w:lastRowFirstColumn="0" w:lastRowLastColumn="0"/>
+              <w:rPr>
+                <w:lang w:val="en-US"/>
+              </w:rPr>
+            </w:pPr>
+            <w:proofErr w:type="spellStart"/>
+            <w:r>
+              <w:rPr>
+                <w:lang w:val="en-US"/>
+              </w:rPr>
+              <w:t>Timebased</w:t>
+            </w:r>
+            <w:proofErr w:type="spellEnd"/>
+          </w:p>
+        </w:tc>
+        <w:tc>
+          <w:tcPr>
+            <w:tcW w:w="1559" w:type="dxa"/>
+          </w:tcPr>
+          <w:p>
+            <w:pPr>
+              <w:cnfStyle w:val="000000000000" w:firstRow="0" w:lastRow="0" w:firstColumn="0" w:lastColumn="0" w:oddVBand="0" w:evenVBand="0" w:oddHBand="0" w:evenHBand="0" w:firstRowFirstColumn="0" w:firstRowLastColumn="0" w:lastRowFirstColumn="0" w:lastRowLastColumn="0"/>
+              <w:rPr>
+                <w:lang w:val="en-US"/>
+              </w:rPr>
+            </w:pPr>
+            <w:r>
+              <w:rPr>
+                <w:lang w:val="en-US"/>
+              </w:rPr>
+              <w:t>Private graph</w:t>
+            </w:r>
+          </w:p>
+        </w:tc>
+        <w:tc>
+          <w:tcPr>
+            <w:tcW w:w="2268" w:type="dxa"/>
+          </w:tcPr>
+          <w:p>
+            <w:pPr>
+              <w:cnfStyle w:val="000000000000" w:firstRow="0" w:lastRow="0" w:firstColumn="0" w:lastColumn="0" w:oddVBand="0" w:evenVBand="0" w:oddHBand="0" w:evenHBand="0" w:firstRowFirstColumn="0" w:firstRowLastColumn="0" w:lastRowFirstColumn="0" w:lastRowLastColumn="0"/>
+              <w:rPr>
+                <w:lang w:val="en-US"/>
+              </w:rPr>
+            </w:pPr>
+            <w:r>
+              <w:rPr>
+                <w:lang w:val="en-US"/>
+              </w:rPr>
+              <w:t>Timestamp ordered</w:t>
+            </w:r>
+          </w:p>
+        </w:tc>
+        <w:tc>
+          <w:tcPr>
+            <w:tcW w:w="1842" w:type="dxa"/>
+          </w:tcPr>
+          <w:p>
+            <w:pPr>
+              <w:cnfStyle w:val="000000000000" w:firstRow="0" w:lastRow="0" w:firstColumn="0" w:lastColumn="0" w:oddVBand="0" w:evenVBand="0" w:oddHBand="0" w:evenHBand="0" w:firstRowFirstColumn="0" w:firstRowLastColumn="0" w:lastRowFirstColumn="0" w:lastRowLastColumn="0"/>
+              <w:rPr>
+                <w:lang w:val="en-US"/>
+              </w:rPr>
+            </w:pPr>
+            <w:r>
+              <w:rPr>
+                <w:lang w:val="en-US"/>
+              </w:rPr>
+              <w:t>Yes</w:t>
+            </w:r>
+          </w:p>
+        </w:tc>
+      </w:tr>
+    </w:tbl>
     <w:p>
       <w:pPr>
         <w:rPr>

</xml_diff>